<commit_message>
Updated retail demand forecasting project
</commit_message>
<xml_diff>
--- a/Reports/Charts and Visualizations EDA.docx
+++ b/Reports/Charts and Visualizations EDA.docx
@@ -5,16 +5,22 @@
     <w:p>
       <w:pPr>
         <w:rPr>
-          <w:lang w:val="en-US"/>
-        </w:rPr>
-      </w:pPr>
-      <w:r>
-        <w:rPr>
+          <w:b/>
+          <w:bCs/>
+          <w:lang w:val="en-US"/>
+        </w:rPr>
+      </w:pPr>
+      <w:bookmarkStart w:id="0" w:name="_GoBack"/>
+      <w:r>
+        <w:rPr>
+          <w:b/>
+          <w:bCs/>
           <w:lang w:val="en-US"/>
         </w:rPr>
         <w:t>Charts and Visualizations EDA</w:t>
       </w:r>
     </w:p>
+    <w:bookmarkEnd w:id="0"/>
     <w:p>
       <w:pPr>
         <w:pStyle w:val="pdq2pgselectionanchorcontainer"/>
@@ -8112,8 +8118,6 @@
         </w:rPr>
         <w:t>Promotions and external economic variables showed weak linear relationships with sales.</w:t>
       </w:r>
-      <w:bookmarkStart w:id="0" w:name="_GoBack"/>
-      <w:bookmarkEnd w:id="0"/>
     </w:p>
     <w:p>
       <w:pPr>
@@ -9393,6 +9397,7 @@
   <w:style w:type="character" w:default="1" w:styleId="DefaultParagraphFont">
     <w:name w:val="Default Paragraph Font"/>
     <w:uiPriority w:val="1"/>
+    <w:semiHidden/>
     <w:unhideWhenUsed/>
   </w:style>
   <w:style w:type="table" w:default="1" w:styleId="TableNormal">

</xml_diff>